<commit_message>
Doc: allinea la coverage in sezione 7 al numero reale post-esclusione
La tabella Quality Gate riportava ancora "~65%" (dedotto da JaCoCo in
locale prima dell'esclusione dello strato Boundary) e "0%" di
duplicazione (obsoleto). Aggiornati ai valori reali da SonarCloud dopo
sonar.coverage.exclusions: coverage ~86% su Controller/Model/DAO,
duplicazione 6,7% (non richiesta dal corso). Aggiunta una nota che
spiega l'esclusione del Boundary, citando la regola del corso.
</commit_message>
<xml_diff>
--- a/docs/UniRide_Technical_Documentation.docx
+++ b/docs/UniRide_Technical_Documentation.docx
@@ -104,11 +104,7 @@
       </w:pPr>
       <w:r>
         <w:t xml:space="preserve">1. SOFTWARE REQUIREMENT SPECIFICATION</w:t>
-      </w:r>
-      <w:r>
         <w:ptab w:alignment="right" w:relativeTo="margin" w:leader="dot"/>
-      </w:r>
-      <w:r>
         <w:t xml:space="preserve">3</w:t>
       </w:r>
     </w:p>
@@ -119,11 +115,7 @@
       </w:pPr>
       <w:r>
         <w:t xml:space="preserve">1.1. Introduction</w:t>
-      </w:r>
-      <w:r>
         <w:ptab w:alignment="right" w:relativeTo="margin" w:leader="dot"/>
-      </w:r>
-      <w:r>
         <w:t xml:space="preserve">3</w:t>
       </w:r>
     </w:p>
@@ -134,11 +126,7 @@
       </w:pPr>
       <w:r>
         <w:t xml:space="preserve">1.2. User Stories</w:t>
-      </w:r>
-      <w:r>
         <w:ptab w:alignment="right" w:relativeTo="margin" w:leader="dot"/>
-      </w:r>
-      <w:r>
         <w:t xml:space="preserve">4</w:t>
       </w:r>
     </w:p>
@@ -149,11 +137,7 @@
       </w:pPr>
       <w:r>
         <w:t xml:space="preserve">1.3. Functional Requirements</w:t>
-      </w:r>
-      <w:r>
         <w:ptab w:alignment="right" w:relativeTo="margin" w:leader="dot"/>
-      </w:r>
-      <w:r>
         <w:t xml:space="preserve">5</w:t>
       </w:r>
     </w:p>
@@ -164,11 +148,7 @@
       </w:pPr>
       <w:r>
         <w:t xml:space="preserve">1.4. Use Cases</w:t>
-      </w:r>
-      <w:r>
         <w:ptab w:alignment="right" w:relativeTo="margin" w:leader="dot"/>
-      </w:r>
-      <w:r>
         <w:t xml:space="preserve">6</w:t>
       </w:r>
     </w:p>
@@ -179,11 +159,7 @@
       </w:pPr>
       <w:r>
         <w:t xml:space="preserve">2. STORYBOARDS</w:t>
-      </w:r>
-      <w:r>
         <w:ptab w:alignment="right" w:relativeTo="margin" w:leader="dot"/>
-      </w:r>
-      <w:r>
         <w:t xml:space="preserve">7</w:t>
       </w:r>
     </w:p>
@@ -194,11 +170,7 @@
       </w:pPr>
       <w:r>
         <w:t xml:space="preserve">3. DESIGN</w:t>
-      </w:r>
-      <w:r>
         <w:ptab w:alignment="right" w:relativeTo="margin" w:leader="dot"/>
-      </w:r>
-      <w:r>
         <w:t xml:space="preserve">8</w:t>
       </w:r>
     </w:p>
@@ -209,11 +181,7 @@
       </w:pPr>
       <w:r>
         <w:t xml:space="preserve">3.1. Class Diagram — VOPC (Analysis)</w:t>
-      </w:r>
-      <w:r>
         <w:ptab w:alignment="right" w:relativeTo="margin" w:leader="dot"/>
-      </w:r>
-      <w:r>
         <w:t xml:space="preserve">8</w:t>
       </w:r>
     </w:p>
@@ -224,11 +192,7 @@
       </w:pPr>
       <w:r>
         <w:t xml:space="preserve">3.2. Class Diagram — Design Level</w:t>
-      </w:r>
-      <w:r>
         <w:ptab w:alignment="right" w:relativeTo="margin" w:leader="dot"/>
-      </w:r>
-      <w:r>
         <w:t xml:space="preserve">14</w:t>
       </w:r>
     </w:p>
@@ -239,11 +203,7 @@
       </w:pPr>
       <w:r>
         <w:t xml:space="preserve">3.3. Design Patterns</w:t>
-      </w:r>
-      <w:r>
         <w:ptab w:alignment="right" w:relativeTo="margin" w:leader="dot"/>
-      </w:r>
-      <w:r>
         <w:t xml:space="preserve">15</w:t>
       </w:r>
     </w:p>
@@ -254,11 +214,7 @@
       </w:pPr>
       <w:r>
         <w:t xml:space="preserve">3.4. Activity Diagram</w:t>
-      </w:r>
-      <w:r>
         <w:ptab w:alignment="right" w:relativeTo="margin" w:leader="dot"/>
-      </w:r>
-      <w:r>
         <w:t xml:space="preserve">16</w:t>
       </w:r>
     </w:p>
@@ -269,11 +225,7 @@
       </w:pPr>
       <w:r>
         <w:t xml:space="preserve">3.5. Sequence Diagram</w:t>
-      </w:r>
-      <w:r>
         <w:ptab w:alignment="right" w:relativeTo="margin" w:leader="dot"/>
-      </w:r>
-      <w:r>
         <w:t xml:space="preserve">17</w:t>
       </w:r>
     </w:p>
@@ -284,11 +236,7 @@
       </w:pPr>
       <w:r>
         <w:t xml:space="preserve">3.6. State Diagram</w:t>
-      </w:r>
-      <w:r>
         <w:ptab w:alignment="right" w:relativeTo="margin" w:leader="dot"/>
-      </w:r>
-      <w:r>
         <w:t xml:space="preserve">18</w:t>
       </w:r>
     </w:p>
@@ -299,11 +247,7 @@
       </w:pPr>
       <w:r>
         <w:t xml:space="preserve">4. TESTING</w:t>
-      </w:r>
-      <w:r>
         <w:ptab w:alignment="right" w:relativeTo="margin" w:leader="dot"/>
-      </w:r>
-      <w:r>
         <w:t xml:space="preserve">19</w:t>
       </w:r>
     </w:p>
@@ -314,11 +258,7 @@
       </w:pPr>
       <w:r>
         <w:t xml:space="preserve">5. EXCEPTIONS</w:t>
-      </w:r>
-      <w:r>
         <w:ptab w:alignment="right" w:relativeTo="margin" w:leader="dot"/>
-      </w:r>
-      <w:r>
         <w:t xml:space="preserve">19</w:t>
       </w:r>
     </w:p>
@@ -329,11 +269,7 @@
       </w:pPr>
       <w:r>
         <w:t xml:space="preserve">6. DATABASES</w:t>
-      </w:r>
-      <w:r>
         <w:ptab w:alignment="right" w:relativeTo="margin" w:leader="dot"/>
-      </w:r>
-      <w:r>
         <w:t xml:space="preserve">20</w:t>
       </w:r>
     </w:p>
@@ -344,11 +280,7 @@
       </w:pPr>
       <w:r>
         <w:t xml:space="preserve">7. SONARCLOUD</w:t>
-      </w:r>
-      <w:r>
         <w:ptab w:alignment="right" w:relativeTo="margin" w:leader="dot"/>
-      </w:r>
-      <w:r>
         <w:t xml:space="preserve">21</w:t>
       </w:r>
     </w:p>
@@ -4542,7 +4474,7 @@
                 <w:sz w:val="20"/>
                 <w:szCs w:val="20"/>
               </w:rPr>
-              <w:t xml:space="preserve">~65%</w:t>
+              <w:t xml:space="preserve">~86% (Controller/Model/DAO; Boundary escluso, vedi nota)</w:t>
             </w:r>
           </w:p>
         </w:tc>
@@ -4613,12 +4545,24 @@
                 <w:sz w:val="20"/>
                 <w:szCs w:val="20"/>
               </w:rPr>
-              <w:t xml:space="preserve">0%</w:t>
+              <w:t xml:space="preserve">6,7% (non richiesto dal corso, vedi nota)</w:t>
             </w:r>
           </w:p>
         </w:tc>
       </w:tr>
     </w:tbl>
+    <w:p>
+      <w:pPr>
+        <w:spacing w:after="160"/>
+      </w:pPr>
+      <w:r>
+        <w:rPr>
+          <w:i w:val="true"/>
+          <w:iCs w:val="true"/>
+        </w:rPr>
+        <w:t xml:space="preserve">Nota sulla coverage: come indicato dal materiale del corso ("nell’analisi effettuata tramite Sonar è necessario escludere le componenti grafiche"), lo strato Boundary (controller grafici JavaFX e relativa CLI) è escluso dal calcolo della coverage tramite sonar.coverage.exclusions in pom.xml, non contenendo per definizione BCE logica applicativa e richiedendo un framework di UI testing dedicato per essere unit-testato in modo significativo. La percentuale di duplicazione non è un vincolo richiesto dal corso.</w:t>
+      </w:r>
+    </w:p>
     <w:p>
       <w:pPr>
         <w:spacing w:after="160"/>

</xml_diff>

<commit_message>
Doc: aggiunge i mockup visivi mancanti agli Storyboard (Draw.io-style)
Le Final Project Detailed Instructions richiedono esplicitamente
storyboard "developed using Draw.io or similar": la sezione 2 aveva
finora solo descrizioni testuali, senza figure. Aggiunti due mockup
wireframe (Login/Registrazione, Dashboard/Le Mie Corse) con frecce di
transizione fra le schermate, coerenti con la palette e il layout reale
dell'app. Indice pagine ricalcolato per lo spostamento di una pagina.
</commit_message>
<xml_diff>
--- a/docs/UniRide_Technical_Documentation.docx
+++ b/docs/UniRide_Technical_Documentation.docx
@@ -193,7 +193,7 @@
       <w:r>
         <w:t xml:space="preserve">3.2. Class Diagram — Design Level</w:t>
         <w:ptab w:alignment="right" w:relativeTo="margin" w:leader="dot"/>
-        <w:t xml:space="preserve">14</w:t>
+        <w:t xml:space="preserve">15</w:t>
       </w:r>
     </w:p>
     <w:p>
@@ -204,7 +204,7 @@
       <w:r>
         <w:t xml:space="preserve">3.3. Design Patterns</w:t>
         <w:ptab w:alignment="right" w:relativeTo="margin" w:leader="dot"/>
-        <w:t xml:space="preserve">15</w:t>
+        <w:t xml:space="preserve">16</w:t>
       </w:r>
     </w:p>
     <w:p>
@@ -215,7 +215,7 @@
       <w:r>
         <w:t xml:space="preserve">3.4. Activity Diagram</w:t>
         <w:ptab w:alignment="right" w:relativeTo="margin" w:leader="dot"/>
-        <w:t xml:space="preserve">16</w:t>
+        <w:t xml:space="preserve">17</w:t>
       </w:r>
     </w:p>
     <w:p>
@@ -226,7 +226,7 @@
       <w:r>
         <w:t xml:space="preserve">3.5. Sequence Diagram</w:t>
         <w:ptab w:alignment="right" w:relativeTo="margin" w:leader="dot"/>
-        <w:t xml:space="preserve">17</w:t>
+        <w:t xml:space="preserve">18</w:t>
       </w:r>
     </w:p>
     <w:p>
@@ -237,7 +237,7 @@
       <w:r>
         <w:t xml:space="preserve">3.6. State Diagram</w:t>
         <w:ptab w:alignment="right" w:relativeTo="margin" w:leader="dot"/>
-        <w:t xml:space="preserve">18</w:t>
+        <w:t xml:space="preserve">19</w:t>
       </w:r>
     </w:p>
     <w:p>
@@ -248,7 +248,7 @@
       <w:r>
         <w:t xml:space="preserve">4. TESTING</w:t>
         <w:ptab w:alignment="right" w:relativeTo="margin" w:leader="dot"/>
-        <w:t xml:space="preserve">19</w:t>
+        <w:t xml:space="preserve">20</w:t>
       </w:r>
     </w:p>
     <w:p>
@@ -259,7 +259,7 @@
       <w:r>
         <w:t xml:space="preserve">5. EXCEPTIONS</w:t>
         <w:ptab w:alignment="right" w:relativeTo="margin" w:leader="dot"/>
-        <w:t xml:space="preserve">19</w:t>
+        <w:t xml:space="preserve">20</w:t>
       </w:r>
     </w:p>
     <w:p>
@@ -270,7 +270,7 @@
       <w:r>
         <w:t xml:space="preserve">6. DATABASES</w:t>
         <w:ptab w:alignment="right" w:relativeTo="margin" w:leader="dot"/>
-        <w:t xml:space="preserve">20</w:t>
+        <w:t xml:space="preserve">21</w:t>
       </w:r>
     </w:p>
     <w:p>
@@ -281,7 +281,7 @@
       <w:r>
         <w:t xml:space="preserve">7. SONARCLOUD</w:t>
         <w:ptab w:alignment="right" w:relativeTo="margin" w:leader="dot"/>
-        <w:t xml:space="preserve">21</w:t>
+        <w:t xml:space="preserve">22</w:t>
       </w:r>
     </w:p>
     <w:p>
@@ -1617,6 +1617,68 @@
     </w:p>
     <w:p>
       <w:pPr>
+        <w:spacing w:after="80" w:before="200"/>
+        <w:jc w:val="center"/>
+      </w:pPr>
+      <w:r>
+        <w:drawing>
+          <wp:inline distT="0" distB="0" distL="0" distR="0">
+            <wp:extent cx="5715000" cy="3153103"/>
+            <wp:effectExtent t="0" r="0" b="0" l="0"/>
+            <wp:docPr id="1" name="" descr="" title=""/>
+            <wp:cNvGraphicFramePr>
+              <a:graphicFrameLocks xmlns:a="http://schemas.openxmlformats.org/drawingml/2006/main" noChangeAspect="1"/>
+            </wp:cNvGraphicFramePr>
+            <a:graphic xmlns:a="http://schemas.openxmlformats.org/drawingml/2006/main">
+              <a:graphicData uri="http://schemas.openxmlformats.org/drawingml/2006/picture">
+                <pic:pic xmlns:pic="http://schemas.openxmlformats.org/drawingml/2006/picture">
+                  <pic:nvPicPr>
+                    <pic:cNvPr id="0" name="" descr=""/>
+                    <pic:cNvPicPr>
+                      <a:picLocks noChangeAspect="1" noChangeArrowheads="1"/>
+                    </pic:cNvPicPr>
+                  </pic:nvPicPr>
+                  <pic:blipFill>
+                    <a:blip r:embed="rId22" cstate="none"/>
+                    <a:srcRect/>
+                    <a:stretch>
+                      <a:fillRect/>
+                    </a:stretch>
+                  </pic:blipFill>
+                  <pic:spPr bwMode="auto">
+                    <a:xfrm>
+                      <a:off x="0" y="0"/>
+                      <a:ext cx="5715000" cy="3153103"/>
+                    </a:xfrm>
+                    <a:prstGeom prst="rect">
+                      <a:avLst/>
+                    </a:prstGeom>
+                  </pic:spPr>
+                </pic:pic>
+              </a:graphicData>
+            </a:graphic>
+          </wp:inline>
+        </w:drawing>
+      </w:r>
+    </w:p>
+    <w:p>
+      <w:pPr>
+        <w:spacing w:after="240"/>
+        <w:jc w:val="center"/>
+      </w:pPr>
+      <w:r>
+        <w:rPr>
+          <w:i/>
+          <w:iCs/>
+          <w:color w:val="555555"/>
+          <w:sz w:val="20"/>
+          <w:szCs w:val="20"/>
+        </w:rPr>
+        <w:t xml:space="preserve">Mockup 1 — Storyboard Login e Registrazione (LoginBoundary / RegisterBoundary)</w:t>
+      </w:r>
+    </w:p>
+    <w:p>
+      <w:pPr>
         <w:spacing w:after="160"/>
       </w:pPr>
       <w:r>
@@ -1641,6 +1703,68 @@
           <w:iCs/>
         </w:rPr>
         <w:t xml:space="preserve">Storyboard 2 — Dashboard e gestione delle prenotazioni</w:t>
+      </w:r>
+    </w:p>
+    <w:p>
+      <w:pPr>
+        <w:spacing w:after="80" w:before="200"/>
+        <w:jc w:val="center"/>
+      </w:pPr>
+      <w:r>
+        <w:drawing>
+          <wp:inline distT="0" distB="0" distL="0" distR="0">
+            <wp:extent cx="5715000" cy="3091721"/>
+            <wp:effectExtent t="0" r="0" b="0" l="0"/>
+            <wp:docPr id="1" name="" descr="" title=""/>
+            <wp:cNvGraphicFramePr>
+              <a:graphicFrameLocks xmlns:a="http://schemas.openxmlformats.org/drawingml/2006/main" noChangeAspect="1"/>
+            </wp:cNvGraphicFramePr>
+            <a:graphic xmlns:a="http://schemas.openxmlformats.org/drawingml/2006/main">
+              <a:graphicData uri="http://schemas.openxmlformats.org/drawingml/2006/picture">
+                <pic:pic xmlns:pic="http://schemas.openxmlformats.org/drawingml/2006/picture">
+                  <pic:nvPicPr>
+                    <pic:cNvPr id="0" name="" descr=""/>
+                    <pic:cNvPicPr>
+                      <a:picLocks noChangeAspect="1" noChangeArrowheads="1"/>
+                    </pic:cNvPicPr>
+                  </pic:nvPicPr>
+                  <pic:blipFill>
+                    <a:blip r:embed="rId23" cstate="none"/>
+                    <a:srcRect/>
+                    <a:stretch>
+                      <a:fillRect/>
+                    </a:stretch>
+                  </pic:blipFill>
+                  <pic:spPr bwMode="auto">
+                    <a:xfrm>
+                      <a:off x="0" y="0"/>
+                      <a:ext cx="5715000" cy="3091721"/>
+                    </a:xfrm>
+                    <a:prstGeom prst="rect">
+                      <a:avLst/>
+                    </a:prstGeom>
+                  </pic:spPr>
+                </pic:pic>
+              </a:graphicData>
+            </a:graphic>
+          </wp:inline>
+        </w:drawing>
+      </w:r>
+    </w:p>
+    <w:p>
+      <w:pPr>
+        <w:spacing w:after="240"/>
+        <w:jc w:val="center"/>
+      </w:pPr>
+      <w:r>
+        <w:rPr>
+          <w:i/>
+          <w:iCs/>
+          <w:color w:val="555555"/>
+          <w:sz w:val="20"/>
+          <w:szCs w:val="20"/>
+        </w:rPr>
+        <w:t xml:space="preserve">Mockup 2 — Storyboard Dashboard e Le Mie Corse (StudentDashboardBoundary / ManageRidesBoundary)</w:t>
       </w:r>
     </w:p>
     <w:p>

</xml_diff>